<commit_message>
String, Data Types and Implementation of Create command
</commit_message>
<xml_diff>
--- a/Day-3.docx
+++ b/Day-3.docx
@@ -24,11 +24,22 @@
     </w:p>
     <w:p>
       <w:pPr>
-        <w:rPr>
-          <w:b/>
-          <w:bCs/>
+        <w:jc w:val="center"/>
+        <w:rPr>
+          <w:b/>
+          <w:bCs/>
+          <w:sz w:val="32"/>
+          <w:szCs w:val="32"/>
         </w:rPr>
       </w:pPr>
+    </w:p>
+    <w:p>
+      <w:pPr>
+        <w:rPr>
+          <w:b/>
+          <w:bCs/>
+        </w:rPr>
+      </w:pPr>
       <w:r>
         <w:rPr>
           <w:b/>
@@ -330,6 +341,7 @@
           <w:b/>
           <w:bCs/>
         </w:rPr>
+        <w:lastRenderedPageBreak/>
         <w:t>BINARY</w:t>
       </w:r>
     </w:p>
@@ -340,7 +352,6 @@
     </w:p>
     <w:p>
       <w:r>
-        <w:lastRenderedPageBreak/>
         <w:t>•   Always stores exactly n bytes.</w:t>
       </w:r>
     </w:p>
@@ -1080,6 +1091,7 @@
                 <w:b/>
                 <w:bCs/>
               </w:rPr>
+              <w:lastRenderedPageBreak/>
               <w:t>Trailing Spaces</w:t>
             </w:r>
           </w:p>
@@ -1161,7 +1173,6 @@
                 <w:b/>
                 <w:bCs/>
               </w:rPr>
-              <w:lastRenderedPageBreak/>
               <w:t>Max Length</w:t>
             </w:r>
           </w:p>
@@ -1915,6 +1926,7 @@
     </w:p>
     <w:p>
       <w:r>
+        <w:lastRenderedPageBreak/>
         <w:t>  -- Output: The full text is stored as-is.</w:t>
       </w:r>
     </w:p>
@@ -1935,7 +1947,6 @@
           <w:b/>
           <w:bCs/>
         </w:rPr>
-        <w:lastRenderedPageBreak/>
         <w:t>TINYTEXT, MEDIUMTEXT, LONGTEXT</w:t>
       </w:r>
     </w:p>
@@ -2329,6 +2340,7 @@
     </w:p>
     <w:p>
       <w:r>
+        <w:lastRenderedPageBreak/>
         <w:t>  -- Output: The permissions field can store multiple values from the set.</w:t>
       </w:r>
     </w:p>
@@ -2699,6 +2711,7 @@
     </w:p>
     <w:p>
       <w:r>
+        <w:lastRenderedPageBreak/>
         <w:t>◦    DATE_</w:t>
       </w:r>
       <w:proofErr w:type="gramStart"/>
@@ -2725,7 +2738,6 @@
     </w:p>
     <w:p>
       <w:r>
-        <w:lastRenderedPageBreak/>
         <w:t xml:space="preserve">◦    </w:t>
       </w:r>
       <w:proofErr w:type="gramStart"/>
@@ -3147,6 +3159,7 @@
           <w:b/>
           <w:bCs/>
         </w:rPr>
+        <w:lastRenderedPageBreak/>
         <w:t>Time Functions</w:t>
       </w:r>
     </w:p>
@@ -3157,7 +3170,6 @@
     </w:p>
     <w:p>
       <w:r>
-        <w:lastRenderedPageBreak/>
         <w:t xml:space="preserve">◦    </w:t>
       </w:r>
       <w:proofErr w:type="gramStart"/>
@@ -3554,6 +3566,7 @@
     </w:p>
     <w:p>
       <w:r>
+        <w:lastRenderedPageBreak/>
         <w:t>  );</w:t>
       </w:r>
     </w:p>
@@ -3574,285 +3587,284 @@
           <w:b/>
           <w:bCs/>
         </w:rPr>
+        <w:t>UPDATE CURRENT_TIMESTAMP</w:t>
+      </w:r>
+    </w:p>
+    <w:p>
+      <w:r>
+        <w:t>•   In MySQL, ON UPDATE CURRENT_TIMESTAMP can be used to automatically update the TIMESTAMP field to the current date and time whenever there is any change in other fields of the row.</w:t>
+      </w:r>
+    </w:p>
+    <w:p>
+      <w:r>
+        <w:t> </w:t>
+      </w:r>
+    </w:p>
+    <w:p>
+      <w:r>
+        <w:t xml:space="preserve">  CREATE TABLE </w:t>
+      </w:r>
+      <w:proofErr w:type="spellStart"/>
+      <w:r>
+        <w:rPr>
+          <w:b/>
+          <w:bCs/>
+        </w:rPr>
+        <w:t>table_name</w:t>
+      </w:r>
+      <w:proofErr w:type="spellEnd"/>
+      <w:r>
+        <w:t xml:space="preserve"> (</w:t>
+      </w:r>
+    </w:p>
+    <w:p>
+      <w:r>
+        <w:t>      </w:t>
+      </w:r>
+      <w:r>
+        <w:rPr>
+          <w:b/>
+          <w:bCs/>
+        </w:rPr>
+        <w:t>column1</w:t>
+      </w:r>
+      <w:r>
+        <w:t xml:space="preserve"> TIMESTAMP DEFAULT CURRENT_TIMESTAMP ON UPDATE CURRENT_TIMESTAMP,</w:t>
+      </w:r>
+    </w:p>
+    <w:p>
+      <w:r>
+        <w:t>      </w:t>
+      </w:r>
+      <w:r>
+        <w:rPr>
+          <w:b/>
+          <w:bCs/>
+        </w:rPr>
+        <w:t>column2</w:t>
+      </w:r>
+      <w:r>
+        <w:t xml:space="preserve"> </w:t>
+      </w:r>
+      <w:proofErr w:type="gramStart"/>
+      <w:r>
+        <w:t>VARCHAR(</w:t>
+      </w:r>
+      <w:proofErr w:type="gramEnd"/>
+      <w:r>
+        <w:t>100),</w:t>
+      </w:r>
+    </w:p>
+    <w:p>
+      <w:r>
+        <w:t>      ...</w:t>
+      </w:r>
+    </w:p>
+    <w:p>
+      <w:r>
+        <w:t>  );</w:t>
+      </w:r>
+    </w:p>
+    <w:p>
+      <w:r>
+        <w:t> </w:t>
+      </w:r>
+    </w:p>
+    <w:p/>
+    <w:p>
+      <w:proofErr w:type="spellStart"/>
+      <w:r>
+        <w:t>mysql</w:t>
+      </w:r>
+      <w:proofErr w:type="spellEnd"/>
+      <w:r>
+        <w:t>&gt; show databases;</w:t>
+      </w:r>
+    </w:p>
+    <w:p>
+      <w:r>
+        <w:t>+------------------------+</w:t>
+      </w:r>
+    </w:p>
+    <w:p>
+      <w:r>
+        <w:t>| Database               |</w:t>
+      </w:r>
+    </w:p>
+    <w:p>
+      <w:r>
+        <w:t>+------------------------+</w:t>
+      </w:r>
+    </w:p>
+    <w:p>
+      <w:r>
+        <w:t xml:space="preserve">| </w:t>
+      </w:r>
+      <w:proofErr w:type="spellStart"/>
+      <w:r>
+        <w:t>information_schema</w:t>
+      </w:r>
+      <w:proofErr w:type="spellEnd"/>
+      <w:r>
+        <w:t xml:space="preserve">     |</w:t>
+      </w:r>
+    </w:p>
+    <w:p>
+      <w:r>
+        <w:t xml:space="preserve">| </w:t>
+      </w:r>
+      <w:proofErr w:type="spellStart"/>
+      <w:r>
+        <w:t>jeevan_raksha_pharmacy</w:t>
+      </w:r>
+      <w:proofErr w:type="spellEnd"/>
+      <w:r>
+        <w:t xml:space="preserve"> |</w:t>
+      </w:r>
+    </w:p>
+    <w:p>
+      <w:r>
+        <w:t xml:space="preserve">| </w:t>
+      </w:r>
+      <w:proofErr w:type="spellStart"/>
+      <w:r>
+        <w:t>mysql</w:t>
+      </w:r>
+      <w:proofErr w:type="spellEnd"/>
+      <w:r>
+        <w:t>                  |</w:t>
+      </w:r>
+    </w:p>
+    <w:p>
+      <w:r>
+        <w:t xml:space="preserve">| </w:t>
+      </w:r>
+      <w:proofErr w:type="spellStart"/>
+      <w:r>
+        <w:t>performance_schema</w:t>
+      </w:r>
+      <w:proofErr w:type="spellEnd"/>
+      <w:r>
+        <w:t xml:space="preserve">     |</w:t>
+      </w:r>
+    </w:p>
+    <w:p>
+      <w:r>
+        <w:t>| sys                    |</w:t>
+      </w:r>
+    </w:p>
+    <w:p>
+      <w:r>
+        <w:t>+------------------------+</w:t>
+      </w:r>
+    </w:p>
+    <w:p>
+      <w:r>
+        <w:t>5 rows in set (0.08 sec)</w:t>
+      </w:r>
+    </w:p>
+    <w:p/>
+    <w:p>
+      <w:proofErr w:type="spellStart"/>
+      <w:r>
+        <w:t>mysql</w:t>
+      </w:r>
+      <w:proofErr w:type="spellEnd"/>
+      <w:r>
+        <w:t>&gt; CREATE DATABASE PFS7;</w:t>
+      </w:r>
+    </w:p>
+    <w:p>
+      <w:r>
+        <w:t>Query OK, 1 row affected (0.06 sec)</w:t>
+      </w:r>
+    </w:p>
+    <w:p/>
+    <w:p>
+      <w:proofErr w:type="spellStart"/>
+      <w:r>
+        <w:t>mysql</w:t>
+      </w:r>
+      <w:proofErr w:type="spellEnd"/>
+      <w:r>
+        <w:t>&gt; SHOW DATABASES;</w:t>
+      </w:r>
+    </w:p>
+    <w:p>
+      <w:r>
+        <w:t>+------------------------+</w:t>
+      </w:r>
+    </w:p>
+    <w:p>
+      <w:r>
+        <w:t>| Database               |</w:t>
+      </w:r>
+    </w:p>
+    <w:p>
+      <w:r>
+        <w:t>+------------------------+</w:t>
+      </w:r>
+    </w:p>
+    <w:p>
+      <w:r>
+        <w:t xml:space="preserve">| </w:t>
+      </w:r>
+      <w:proofErr w:type="spellStart"/>
+      <w:r>
+        <w:t>information_schema</w:t>
+      </w:r>
+      <w:proofErr w:type="spellEnd"/>
+      <w:r>
+        <w:t xml:space="preserve">     |</w:t>
+      </w:r>
+    </w:p>
+    <w:p>
+      <w:r>
+        <w:t xml:space="preserve">| </w:t>
+      </w:r>
+      <w:proofErr w:type="spellStart"/>
+      <w:r>
+        <w:t>jeevan_raksha_pharmacy</w:t>
+      </w:r>
+      <w:proofErr w:type="spellEnd"/>
+      <w:r>
+        <w:t xml:space="preserve"> |</w:t>
+      </w:r>
+    </w:p>
+    <w:p>
+      <w:r>
+        <w:t xml:space="preserve">| </w:t>
+      </w:r>
+      <w:proofErr w:type="spellStart"/>
+      <w:r>
+        <w:t>mysql</w:t>
+      </w:r>
+      <w:proofErr w:type="spellEnd"/>
+      <w:r>
+        <w:t>                  |</w:t>
+      </w:r>
+    </w:p>
+    <w:p>
+      <w:r>
         <w:lastRenderedPageBreak/>
-        <w:t>UPDATE CURRENT_TIMESTAMP</w:t>
-      </w:r>
-    </w:p>
-    <w:p>
-      <w:r>
-        <w:t>•   In MySQL, ON UPDATE CURRENT_TIMESTAMP can be used to automatically update the TIMESTAMP field to the current date and time whenever there is any change in other fields of the row.</w:t>
-      </w:r>
-    </w:p>
-    <w:p>
-      <w:r>
-        <w:t> </w:t>
-      </w:r>
-    </w:p>
-    <w:p>
-      <w:r>
-        <w:t xml:space="preserve">  CREATE TABLE </w:t>
+        <w:t xml:space="preserve">| </w:t>
       </w:r>
       <w:proofErr w:type="spellStart"/>
       <w:r>
-        <w:rPr>
-          <w:b/>
-          <w:bCs/>
-        </w:rPr>
-        <w:t>table_name</w:t>
+        <w:t>performance_schema</w:t>
       </w:r>
       <w:proofErr w:type="spellEnd"/>
       <w:r>
-        <w:t xml:space="preserve"> (</w:t>
-      </w:r>
-    </w:p>
-    <w:p>
-      <w:r>
-        <w:t>      </w:t>
-      </w:r>
-      <w:r>
-        <w:rPr>
-          <w:b/>
-          <w:bCs/>
-        </w:rPr>
-        <w:t>column1</w:t>
-      </w:r>
-      <w:r>
-        <w:t xml:space="preserve"> TIMESTAMP DEFAULT CURRENT_TIMESTAMP ON UPDATE CURRENT_TIMESTAMP,</w:t>
-      </w:r>
-    </w:p>
-    <w:p>
-      <w:r>
-        <w:t>      </w:t>
-      </w:r>
-      <w:r>
-        <w:rPr>
-          <w:b/>
-          <w:bCs/>
-        </w:rPr>
-        <w:t>column2</w:t>
-      </w:r>
-      <w:r>
-        <w:t xml:space="preserve"> </w:t>
-      </w:r>
-      <w:proofErr w:type="gramStart"/>
-      <w:r>
-        <w:t>VARCHAR(</w:t>
-      </w:r>
-      <w:proofErr w:type="gramEnd"/>
-      <w:r>
-        <w:t>100),</w:t>
-      </w:r>
-    </w:p>
-    <w:p>
-      <w:r>
-        <w:t>      ...</w:t>
-      </w:r>
-    </w:p>
-    <w:p>
-      <w:r>
-        <w:t>  );</w:t>
-      </w:r>
-    </w:p>
-    <w:p>
-      <w:r>
-        <w:t> </w:t>
-      </w:r>
-    </w:p>
-    <w:p/>
-    <w:p>
-      <w:proofErr w:type="spellStart"/>
-      <w:r>
-        <w:t>mysql</w:t>
-      </w:r>
-      <w:proofErr w:type="spellEnd"/>
-      <w:r>
-        <w:t>&gt; show databases;</w:t>
-      </w:r>
-    </w:p>
-    <w:p>
-      <w:r>
-        <w:t>+------------------------+</w:t>
-      </w:r>
-    </w:p>
-    <w:p>
-      <w:r>
-        <w:t>| Database               |</w:t>
-      </w:r>
-    </w:p>
-    <w:p>
-      <w:r>
-        <w:t>+------------------------+</w:t>
-      </w:r>
-    </w:p>
-    <w:p>
-      <w:r>
-        <w:t xml:space="preserve">| </w:t>
-      </w:r>
-      <w:proofErr w:type="spellStart"/>
-      <w:r>
-        <w:t>information_schema</w:t>
-      </w:r>
-      <w:proofErr w:type="spellEnd"/>
-      <w:r>
         <w:t xml:space="preserve">     |</w:t>
       </w:r>
     </w:p>
     <w:p>
       <w:r>
-        <w:t xml:space="preserve">| </w:t>
-      </w:r>
-      <w:proofErr w:type="spellStart"/>
-      <w:r>
-        <w:t>jeevan_raksha_pharmacy</w:t>
-      </w:r>
-      <w:proofErr w:type="spellEnd"/>
-      <w:r>
-        <w:t xml:space="preserve"> |</w:t>
-      </w:r>
-    </w:p>
-    <w:p>
-      <w:r>
-        <w:t xml:space="preserve">| </w:t>
-      </w:r>
-      <w:proofErr w:type="spellStart"/>
-      <w:r>
-        <w:t>mysql</w:t>
-      </w:r>
-      <w:proofErr w:type="spellEnd"/>
-      <w:r>
-        <w:t>                  |</w:t>
-      </w:r>
-    </w:p>
-    <w:p>
-      <w:r>
-        <w:t xml:space="preserve">| </w:t>
-      </w:r>
-      <w:proofErr w:type="spellStart"/>
-      <w:r>
-        <w:t>performance_schema</w:t>
-      </w:r>
-      <w:proofErr w:type="spellEnd"/>
-      <w:r>
-        <w:t xml:space="preserve">     |</w:t>
-      </w:r>
-    </w:p>
-    <w:p>
-      <w:r>
-        <w:t>| sys                    |</w:t>
-      </w:r>
-    </w:p>
-    <w:p>
-      <w:r>
-        <w:t>+------------------------+</w:t>
-      </w:r>
-    </w:p>
-    <w:p>
-      <w:r>
-        <w:t>5 rows in set (0.08 sec)</w:t>
-      </w:r>
-    </w:p>
-    <w:p/>
-    <w:p>
-      <w:proofErr w:type="spellStart"/>
-      <w:r>
-        <w:t>mysql</w:t>
-      </w:r>
-      <w:proofErr w:type="spellEnd"/>
-      <w:r>
-        <w:t>&gt; CREATE DATABASE PFS7;</w:t>
-      </w:r>
-    </w:p>
-    <w:p>
-      <w:r>
-        <w:t>Query OK, 1 row affected (0.06 sec)</w:t>
-      </w:r>
-    </w:p>
-    <w:p/>
-    <w:p>
-      <w:proofErr w:type="spellStart"/>
-      <w:r>
-        <w:t>mysql</w:t>
-      </w:r>
-      <w:proofErr w:type="spellEnd"/>
-      <w:r>
-        <w:t>&gt; SHOW DATABASES;</w:t>
-      </w:r>
-    </w:p>
-    <w:p>
-      <w:r>
-        <w:t>+------------------------+</w:t>
-      </w:r>
-    </w:p>
-    <w:p>
-      <w:r>
-        <w:t>| Database               |</w:t>
-      </w:r>
-    </w:p>
-    <w:p>
-      <w:r>
-        <w:t>+------------------------+</w:t>
-      </w:r>
-    </w:p>
-    <w:p>
-      <w:r>
-        <w:t xml:space="preserve">| </w:t>
-      </w:r>
-      <w:proofErr w:type="spellStart"/>
-      <w:r>
-        <w:t>information_schema</w:t>
-      </w:r>
-      <w:proofErr w:type="spellEnd"/>
-      <w:r>
-        <w:t xml:space="preserve">     |</w:t>
-      </w:r>
-    </w:p>
-    <w:p>
-      <w:r>
-        <w:t xml:space="preserve">| </w:t>
-      </w:r>
-      <w:proofErr w:type="spellStart"/>
-      <w:r>
-        <w:t>jeevan_raksha_pharmacy</w:t>
-      </w:r>
-      <w:proofErr w:type="spellEnd"/>
-      <w:r>
-        <w:t xml:space="preserve"> |</w:t>
-      </w:r>
-    </w:p>
-    <w:p>
-      <w:r>
-        <w:t xml:space="preserve">| </w:t>
-      </w:r>
-      <w:proofErr w:type="spellStart"/>
-      <w:r>
-        <w:t>mysql</w:t>
-      </w:r>
-      <w:proofErr w:type="spellEnd"/>
-      <w:r>
-        <w:t>                  |</w:t>
-      </w:r>
-    </w:p>
-    <w:p>
-      <w:r>
-        <w:t xml:space="preserve">| </w:t>
-      </w:r>
-      <w:proofErr w:type="spellStart"/>
-      <w:r>
-        <w:t>performance_schema</w:t>
-      </w:r>
-      <w:proofErr w:type="spellEnd"/>
-      <w:r>
-        <w:t xml:space="preserve">     |</w:t>
-      </w:r>
-    </w:p>
-    <w:p>
-      <w:r>
         <w:t>| pfs3                   |</w:t>
       </w:r>
     </w:p>
     <w:p>
       <w:r>
-        <w:lastRenderedPageBreak/>
         <w:t>| sys                    |</w:t>
       </w:r>
     </w:p>
@@ -4588,6 +4600,7 @@
   <w:style w:type="character" w:default="1" w:styleId="DefaultParagraphFont">
     <w:name w:val="Default Paragraph Font"/>
     <w:uiPriority w:val="1"/>
+    <w:semiHidden/>
     <w:unhideWhenUsed/>
   </w:style>
   <w:style w:type="table" w:default="1" w:styleId="TableNormal">

</xml_diff>